<commit_message>
Ready for Annabel to review!
</commit_message>
<xml_diff>
--- a/writing/smile_R3_SI.docx
+++ b/writing/smile_R3_SI.docx
@@ -26,6 +26,12 @@
       <w:r>
         <w:t>Supplemental Materials</w:t>
       </w:r>
+      <w:r>
+        <w:t xml:space="preserve">: </w:t>
+      </w:r>
+      <w:r>
+        <w:t>Smiling your way to happiness or misery? Experimental tests of competing perspectives</w:t>
+      </w:r>
     </w:p>
     <w:p>
       <w:pPr>
@@ -38,20 +44,9 @@
     <w:p>
       <w:pPr>
         <w:pStyle w:val="Author"/>
-        <w:tabs>
-          <w:tab w:val="center" w:pos="4680"/>
-          <w:tab w:val="right" w:pos="9360"/>
-        </w:tabs>
-        <w:jc w:val="left"/>
-      </w:pPr>
-      <w:r>
-        <w:tab/>
-      </w:r>
+      </w:pPr>
       <w:r>
         <w:t>Nicholas A. Coles, Annabel Dang, and Joao Francisco Goes Braga Takayanagi</w:t>
-      </w:r>
-      <w:r>
-        <w:tab/>
       </w:r>
     </w:p>
     <w:p>
@@ -112,225 +107,6 @@
     <w:p>
       <w:pPr>
         <w:pStyle w:val="BodyText"/>
-      </w:pPr>
-      <w:bookmarkStart w:id="2" w:name="supplemental-table-1"/>
-      <w:bookmarkEnd w:id="1"/>
-      <w:r>
-        <w:lastRenderedPageBreak/>
-        <w:t xml:space="preserve">In addition to the </w:t>
-      </w:r>
-      <w:r>
-        <w:t>overview</w:t>
-      </w:r>
-      <w:r>
-        <w:t xml:space="preserve"> in the main manuscript, Supplemental Table SI contains pairwise comparisons of </w:t>
-      </w:r>
-      <w:r>
-        <w:t>self-reported happiness when participants posed smiles vs. expressed naturally.</w:t>
-      </w:r>
-      <w:r>
-        <w:t xml:space="preserve"> </w:t>
-      </w:r>
-    </w:p>
-    <w:p>
-      <w:pPr>
-        <w:pStyle w:val="BodyText"/>
-      </w:pPr>
-      <w:r>
-        <w:t xml:space="preserve">Supplemental Figure 1 provides an overview of our primary results when participants were excluded for </w:t>
-      </w:r>
-      <w:r>
-        <w:t xml:space="preserve">not </w:t>
-      </w:r>
-      <w:r>
-        <w:t xml:space="preserve">exhibiting moderate increases in smiling activity </w:t>
-      </w:r>
-      <w:r>
-        <w:t xml:space="preserve">during the happy </w:t>
-      </w:r>
-      <w:r>
-        <w:t xml:space="preserve">(vs. natural expression) </w:t>
-      </w:r>
-      <w:r>
-        <w:t>posing trials</w:t>
-      </w:r>
-      <w:r>
-        <w:t xml:space="preserve">. This was operationalized as Action Unit 12 activity detected by the facial expression analysis software, </w:t>
-      </w:r>
-      <w:proofErr w:type="spellStart"/>
-      <w:r>
-        <w:t>OpenFace</w:t>
-      </w:r>
-      <w:proofErr w:type="spellEnd"/>
-      <w:r>
-        <w:t xml:space="preserve"> 2.2.0</w:t>
-      </w:r>
-      <w:r>
-        <w:t>.</w:t>
-      </w:r>
-      <w:r>
-        <w:t xml:space="preserve"> </w:t>
-      </w:r>
-    </w:p>
-    <w:p>
-      <w:pPr>
-        <w:pStyle w:val="BodyText"/>
-      </w:pPr>
-      <w:r>
-        <w:t>`````</w:t>
-      </w:r>
-    </w:p>
-    <w:p>
-      <w:pPr>
-        <w:pStyle w:val="BodyText"/>
-      </w:pPr>
-      <w:r>
-        <w:t xml:space="preserve">As a reminder, we used </w:t>
-      </w:r>
-      <w:proofErr w:type="spellStart"/>
-      <w:r>
-        <w:t>OpenFace</w:t>
-      </w:r>
-      <w:proofErr w:type="spellEnd"/>
-      <w:r>
-        <w:t xml:space="preserve"> 2.2.0 because our initial software became deprecated.</w:t>
-      </w:r>
-    </w:p>
-    <w:p>
-      <w:pPr>
-        <w:pStyle w:val="BodyText"/>
-      </w:pPr>
-      <w:r>
-        <w:t xml:space="preserve">Initially, we pre-registered a X/10 cut-off in Hume – which corresponds to a X/10 cut-off in </w:t>
-      </w:r>
-      <w:proofErr w:type="spellStart"/>
-      <w:r>
-        <w:t>OpenFace’s</w:t>
-      </w:r>
-      <w:proofErr w:type="spellEnd"/>
-      <w:r>
-        <w:t xml:space="preserve"> scaling.</w:t>
-      </w:r>
-    </w:p>
-    <w:p>
-      <w:pPr>
-        <w:pStyle w:val="BodyText"/>
-      </w:pPr>
-      <w:r>
-        <w:t>However, this led to an unexpectedly large loss of data (X%). We thus additionally considered a less stringent X/10 cut-off, which retained X% of the data.</w:t>
-      </w:r>
-    </w:p>
-    <w:p>
-      <w:pPr>
-        <w:pStyle w:val="BodyText"/>
-      </w:pPr>
-      <w:r>
-        <w:t>When deploying the soft cut-off, all our patterns replicated.</w:t>
-      </w:r>
-    </w:p>
-    <w:p>
-      <w:pPr>
-        <w:pStyle w:val="BodyText"/>
-      </w:pPr>
-      <w:r>
-        <w:t>When deploying the hard cut-off, patterns were numerically similar. However, the mood-boosting effects of voluntarily posed smiles in negative contexts were no longer statistically significant.</w:t>
-      </w:r>
-    </w:p>
-    <w:p>
-      <w:pPr>
-        <w:pStyle w:val="BodyText"/>
-      </w:pPr>
-      <w:r>
-        <w:t>`````</w:t>
-      </w:r>
-    </w:p>
-    <w:p>
-      <w:pPr>
-        <w:pStyle w:val="BodyText"/>
-      </w:pPr>
-      <w:r>
-        <w:t>I’d like to make a surgical change to the code.</w:t>
-      </w:r>
-    </w:p>
-    <w:p>
-      <w:pPr>
-        <w:pStyle w:val="BodyText"/>
-      </w:pPr>
-      <w:r>
-        <w:t xml:space="preserve">I want the soft and hard </w:t>
-      </w:r>
-      <w:r>
-        <w:t>sensitivity analyses to be panels in the same figure. Panel A will be labeled “Weak smiles included”. Panel B will be labeled “Weak smiles excluded”.</w:t>
-      </w:r>
-    </w:p>
-    <w:p>
-      <w:pPr>
-        <w:pStyle w:val="BodyText"/>
-      </w:pPr>
-      <w:r>
-        <w:t xml:space="preserve">Initially, we pre-registered that </w:t>
-      </w:r>
-    </w:p>
-    <w:p>
-      <w:pPr>
-        <w:pStyle w:val="BodyText"/>
-      </w:pPr>
-    </w:p>
-    <w:p>
-      <w:pPr>
-        <w:pStyle w:val="BodyText"/>
-      </w:pPr>
-      <w:r>
-        <w:lastRenderedPageBreak/>
-        <w:t>&lt;bring back in both the soft and hard inclusion. Label them as so. Then add a note about how this may have been too stringent.</w:t>
-      </w:r>
-    </w:p>
-    <w:p>
-      <w:pPr>
-        <w:pStyle w:val="BodyText"/>
-      </w:pPr>
-      <w:r>
-        <w:t xml:space="preserve">in Action Unit 12 </w:t>
-      </w:r>
-    </w:p>
-    <w:p>
-      <w:pPr>
-        <w:pStyle w:val="BodyText"/>
-      </w:pPr>
-      <w:r>
-        <w:t>exhibit</w:t>
-      </w:r>
-      <w:r>
-        <w:t>ing</w:t>
-      </w:r>
-      <w:r>
-        <w:t xml:space="preserve"> at least a moderate increase (0.3 or above) in Action</w:t>
-      </w:r>
-    </w:p>
-    <w:p>
-      <w:pPr>
-        <w:pStyle w:val="BodyText"/>
-      </w:pPr>
-      <w:r>
-        <w:t xml:space="preserve">Unit 12 activity </w:t>
-      </w:r>
-    </w:p>
-    <w:p>
-      <w:pPr>
-        <w:pStyle w:val="BodyText"/>
-        <w:rPr>
-          <w:b/>
-          <w:bCs/>
-        </w:rPr>
-      </w:pPr>
-    </w:p>
-    <w:p>
-      <w:pPr>
-        <w:pStyle w:val="BodyText"/>
-        <w:rPr>
-          <w:b/>
-          <w:bCs/>
-        </w:rPr>
         <w:sectPr>
           <w:headerReference w:type="even" r:id="rId8"/>
           <w:headerReference w:type="default" r:id="rId9"/>
@@ -343,6 +119,27 @@
           <w:cols w:space="720"/>
         </w:sectPr>
       </w:pPr>
+      <w:bookmarkStart w:id="2" w:name="supplemental-table-1"/>
+      <w:bookmarkEnd w:id="1"/>
+      <w:r>
+        <w:lastRenderedPageBreak/>
+        <w:t xml:space="preserve">In addition to the overview in the main manuscript, Table SI contains pairwise comparisons of </w:t>
+      </w:r>
+      <w:r>
+        <w:t xml:space="preserve">self-reported happiness </w:t>
+      </w:r>
+      <w:r>
+        <w:t>after</w:t>
+      </w:r>
+      <w:r>
+        <w:t xml:space="preserve"> participants posed smiles vs. expressed </w:t>
+      </w:r>
+      <w:r>
+        <w:t xml:space="preserve">themselves </w:t>
+      </w:r>
+      <w:r>
+        <w:t>naturally.</w:t>
+      </w:r>
     </w:p>
     <w:p>
       <w:pPr>
@@ -355,14 +152,7 @@
           <w:bCs/>
         </w:rPr>
         <w:lastRenderedPageBreak/>
-        <w:t>Table S1</w:t>
-      </w:r>
-      <w:r>
-        <w:rPr>
-          <w:b/>
-          <w:bCs/>
-        </w:rPr>
-        <w:t xml:space="preserve">. </w:t>
+        <w:t xml:space="preserve">Table S1. </w:t>
       </w:r>
       <w:r>
         <w:t xml:space="preserve">Pairwise </w:t>
@@ -382,7 +172,6 @@
       <w:r>
         <w:t>expressed naturally.</w:t>
       </w:r>
-      <w:bookmarkStart w:id="3" w:name="tbl-si1-output"/>
     </w:p>
     <w:tbl>
       <w:tblPr>
@@ -1409,7 +1198,6 @@
         </w:tc>
       </w:tr>
     </w:tbl>
-    <w:bookmarkEnd w:id="3"/>
     <w:p>
       <w:pPr>
         <w:pStyle w:val="AfterWithoutNote"/>
@@ -1433,13 +1221,7 @@
         <w:t>EMM</w:t>
       </w:r>
       <w:r>
-        <w:t xml:space="preserve"> = estimated marginal mean </w:t>
-      </w:r>
-      <w:r>
-        <w:t xml:space="preserve">difference </w:t>
-      </w:r>
-      <w:r>
-        <w:t xml:space="preserve">(smile − natural). CI = confidence interval. </w:t>
+        <w:t xml:space="preserve"> = estimated marginal mean difference (smile − natural). CI = confidence interval. </w:t>
       </w:r>
       <w:r>
         <w:rPr>
@@ -1492,30 +1274,82 @@
     </w:p>
     <w:p>
       <w:pPr>
-        <w:pStyle w:val="Heading1"/>
-      </w:pPr>
-      <w:bookmarkStart w:id="4" w:name="supplemental-figure-1"/>
-      <w:bookmarkEnd w:id="2"/>
-      <w:r>
-        <w:lastRenderedPageBreak/>
-        <w:t>Supplemental Figure 1</w:t>
-      </w:r>
+        <w:pStyle w:val="BodyText"/>
+        <w:sectPr>
+          <w:pgSz w:w="15840" w:h="12240" w:orient="landscape"/>
+          <w:pgMar w:top="1440" w:right="1440" w:bottom="1440" w:left="1440" w:header="720" w:footer="720" w:gutter="0"/>
+          <w:cols w:space="720"/>
+          <w:docGrid w:linePitch="326"/>
+        </w:sectPr>
+      </w:pPr>
     </w:p>
     <w:p>
       <w:pPr>
-        <w:pStyle w:val="FigureTitle"/>
-      </w:pPr>
-      <w:bookmarkStart w:id="5" w:name="fig-si1"/>
-      <w:r>
-        <w:t>Figure 1</w:t>
+        <w:pStyle w:val="BodyText"/>
+      </w:pPr>
+      <w:r>
+        <w:lastRenderedPageBreak/>
+        <w:t>Supplemental Figure 1 provides an overview of our primary results when participants were excluded for not exhibiting moderate increases in smiling activity during the happy posing trials. Using Facial Action Coding System classifications, this was operationalized as Action Unit 12 activity, which is associated with pulling the corner of the lips back towards the ear. For facial expression analysis, we originally planned to use Hume AI. However, we later switched to OpenFace 2.2.0 because Hume AI deprecated their expression analysis application before we completed our study. Because Hume AI (0-1) and OpenFace (0-5) have different scaling, we adjusted our initial .3/1 cutoff to 1.5/5. This led to an unexpectedly large number of exclusions (n = 658; 56% of total sample). We thus conducted an additional sensitivity analysis with a less stringent cutoff of 0.5/5 (n = 410 excluded; 35% of total sample).</w:t>
       </w:r>
     </w:p>
     <w:p>
       <w:pPr>
-        <w:pStyle w:val="Caption"/>
-      </w:pPr>
-      <w:r>
-        <w:t>Fig S1. Hard sensitivity check. Differences in self-reported happiness after participants posed happy vs. neutral expressions (y-axis), restricted to participants who complied with facial expression instructions, made no math errors, and were not aware of the study’s true purpose. Points represent the estimated marginal mean and error bars represent 95% confidence intervals. Results are visualized separately for each combination of the three experimentally manipulated factors (denoted by x-axis and legend).</w:t>
+        <w:pStyle w:val="BodyText"/>
+      </w:pPr>
+      <w:r>
+        <w:t>As shown in Supplemental Figure 1, Panel A, our main results replicated when using a less stringent cutoff. When using a more stringent cutoff, patterns were numerically similar (Supplemental Figure 1, Panel B). However, the mood-boosting effects of voluntarily posing smiles in negative contexts were no longer statistically significant.</w:t>
+      </w:r>
+    </w:p>
+    <w:p>
+      <w:pPr>
+        <w:pStyle w:val="FigureTitle"/>
+        <w:rPr>
+          <w:b w:val="0"/>
+          <w:bCs/>
+        </w:rPr>
+      </w:pPr>
+      <w:bookmarkStart w:id="3" w:name="supplemental-figure-1"/>
+      <w:bookmarkStart w:id="4" w:name="fig-si1"/>
+      <w:bookmarkEnd w:id="2"/>
+      <w:r>
+        <w:lastRenderedPageBreak/>
+        <w:t>Figure </w:t>
+      </w:r>
+      <w:r>
+        <w:t>S</w:t>
+      </w:r>
+      <w:r>
+        <w:t>1</w:t>
+      </w:r>
+      <w:r>
+        <w:rPr>
+          <w:b w:val="0"/>
+          <w:i/>
+        </w:rPr>
+        <w:t xml:space="preserve">. </w:t>
+      </w:r>
+      <w:r>
+        <w:rPr>
+          <w:b w:val="0"/>
+          <w:bCs/>
+        </w:rPr>
+        <w:t xml:space="preserve">Results from sensitivity analysis wherein participants with weak smiles were included (Panel A) and excluded (Panel B). Y-axis denotes differences in self-reported happiness after participants posed happy vs. neutral expressions. Points represent the estimated marginal </w:t>
+      </w:r>
+      <w:proofErr w:type="gramStart"/>
+      <w:r>
+        <w:rPr>
+          <w:b w:val="0"/>
+          <w:bCs/>
+        </w:rPr>
+        <w:t>mean</w:t>
+      </w:r>
+      <w:proofErr w:type="gramEnd"/>
+      <w:r>
+        <w:rPr>
+          <w:b w:val="0"/>
+          <w:bCs/>
+        </w:rPr>
+        <w:t xml:space="preserve"> and error bars represent 95% confidence intervals. Results are visualized separately for each combination of the three experimentally manipulated factors (denoted by x-axis and legend).</w:t>
       </w:r>
     </w:p>
     <w:p>
@@ -1526,10 +1360,9 @@
         <w:rPr>
           <w:noProof/>
         </w:rPr>
-        <w:lastRenderedPageBreak/>
         <w:drawing>
-          <wp:inline distT="0" distB="0" distL="0" distR="0" wp14:anchorId="2C32C245" wp14:editId="3253922E">
-            <wp:extent cx="5943600" cy="3962400"/>
+          <wp:inline distT="0" distB="0" distL="0" distR="0" wp14:anchorId="7EF10EDC" wp14:editId="00D40D01">
+            <wp:extent cx="5943600" cy="2971800"/>
             <wp:effectExtent l="0" t="0" r="0" b="0"/>
             <wp:docPr id="29" name="Picture"/>
             <wp:cNvGraphicFramePr/>
@@ -1537,7 +1370,7 @@
               <a:graphicData uri="http://schemas.openxmlformats.org/drawingml/2006/picture">
                 <pic:pic xmlns:pic="http://schemas.openxmlformats.org/drawingml/2006/picture">
                   <pic:nvPicPr>
-                    <pic:cNvPr id="30" name="Picture" descr="../../../../figures/smile25b_happy_sens_plot.jpg"/>
+                    <pic:cNvPr id="30" name="Picture" descr="../figures/smile25b_sens_plot.jpg"/>
                     <pic:cNvPicPr>
                       <a:picLocks noChangeAspect="1" noChangeArrowheads="1"/>
                     </pic:cNvPicPr>
@@ -1551,7 +1384,7 @@
                   <pic:spPr bwMode="auto">
                     <a:xfrm>
                       <a:off x="0" y="0"/>
-                      <a:ext cx="5943600" cy="3962400"/>
+                      <a:ext cx="5943600" cy="2971800"/>
                     </a:xfrm>
                     <a:prstGeom prst="rect">
                       <a:avLst/>
@@ -1569,11 +1402,11 @@
           </wp:inline>
         </w:drawing>
       </w:r>
+      <w:bookmarkEnd w:id="3"/>
       <w:bookmarkEnd w:id="4"/>
-      <w:bookmarkEnd w:id="5"/>
     </w:p>
     <w:sectPr>
-      <w:pgSz w:w="15840" w:h="12240" w:orient="landscape"/>
+      <w:pgSz w:w="12240" w:h="15840"/>
       <w:pgMar w:top="1440" w:right="1440" w:bottom="1440" w:left="1440" w:header="720" w:footer="720" w:gutter="0"/>
       <w:cols w:space="720"/>
       <w:docGrid w:linePitch="326"/>
@@ -1927,7 +1760,7 @@
   <w:abstractNum w:abstractNumId="10" w15:restartNumberingAfterBreak="0">
     <w:nsid w:val="0000A990"/>
     <w:multiLevelType w:val="multilevel"/>
-    <w:tmpl w:val="9D4E6206"/>
+    <w:tmpl w:val="E0747D0C"/>
     <w:lvl w:ilvl="0">
       <w:numFmt w:val="bullet"/>
       <w:lvlText w:val=" "/>
@@ -2154,7 +1987,7 @@
   <w:num w:numId="21" w16cid:durableId="2107966237">
     <w:abstractNumId w:val="0"/>
   </w:num>
-  <w:num w:numId="22" w16cid:durableId="162358180">
+  <w:num w:numId="22" w16cid:durableId="710810419">
     <w:abstractNumId w:val="10"/>
   </w:num>
 </w:numbering>

</xml_diff>